<commit_message>
Testing and working with a modern setup, please update your packages! This is a new release.
</commit_message>
<xml_diff>
--- a/example/docs/Notes.docx
+++ b/example/docs/Notes.docx
@@ -52,7 +52,7 @@
         </w:p>
       </w:sdtContent>
     </w:sdt>
-    <w:bookmarkStart w:id="21" w:name="introduction"/>
+    <w:bookmarkStart w:id="10" w:name="introduction"/>
     <w:p>
       <w:pPr>
         <w:pStyle w:val="Heading1"/>
@@ -71,7 +71,7 @@
       <w:r>
         <w:t xml:space="preserve"> </w:t>
       </w:r>
-      <w:hyperlink r:id="rId20">
+      <w:hyperlink r:id="rId9">
         <w:r>
           <w:rPr>
             <w:rStyle w:val="Hyperlink"/>
@@ -110,8 +110,8 @@
         <w:t xml:space="preserve">a work in progress. Like everything right now!</w:t>
       </w:r>
     </w:p>
-    <w:bookmarkEnd w:id="21"/>
-    <w:bookmarkStart w:id="26" w:name="Xa733c24dc389b1d53fdf94fffeef268aae9c965"/>
+    <w:bookmarkEnd w:id="10"/>
+    <w:bookmarkStart w:id="15" w:name="Xa733c24dc389b1d53fdf94fffeef268aae9c965"/>
     <w:p>
       <w:pPr>
         <w:pStyle w:val="Heading1"/>
@@ -231,7 +231,7 @@
       <w:r>
         <w:t xml:space="preserve">You can check your document meets the legal requirement of WCAG 2.1 Level AA with e.g. </w:t>
       </w:r>
-      <w:hyperlink r:id="rId22">
+      <w:hyperlink r:id="rId11">
         <w:r>
           <w:rPr>
             <w:rStyle w:val="Hyperlink"/>
@@ -376,7 +376,7 @@
       <w:r>
         <w:t xml:space="preserve"> </w:t>
       </w:r>
-      <w:hyperlink r:id="rId23">
+      <w:hyperlink r:id="rId12">
         <w:r>
           <w:rPr>
             <w:rStyle w:val="Hyperlink"/>
@@ -435,7 +435,7 @@
         <w:t xml:space="preserve">The output from ClavertonDown will meet these requirements as far as possible. However, we cannot stop you from doing things which will fail to meet requirements. In particular, if you use images, sound, videos, colour or interactive/dynamic elements within the HTML you will need to ensure that you have done so within the accessibility requirements.</w:t>
       </w:r>
     </w:p>
-    <w:bookmarkStart w:id="24" w:name="why-do-we-still-supply-inaccessible-pdfs"/>
+    <w:bookmarkStart w:id="13" w:name="why-do-we-still-supply-inaccessible-pdfs"/>
     <w:p>
       <w:pPr>
         <w:pStyle w:val="Heading2"/>
@@ -540,8 +540,8 @@
         <w:t xml:space="preserve">students, disabled or not, and many will still select PDF.</w:t>
       </w:r>
     </w:p>
-    <w:bookmarkEnd w:id="24"/>
-    <w:bookmarkStart w:id="25" w:name="X00dca33e8d0269481fe1dab4648510be7c79313"/>
+    <w:bookmarkEnd w:id="13"/>
+    <w:bookmarkStart w:id="14" w:name="X00dca33e8d0269481fe1dab4648510be7c79313"/>
     <w:p>
       <w:pPr>
         <w:pStyle w:val="Heading2"/>
@@ -666,9 +666,9 @@
         <w:t xml:space="preserve">When you click on this resource you will see the HTML book version of the notes. This is technically accessible, searchable and usable on a mobile device. In the menu at the top there is a download button, from here a student can access any of the other formats. This is as close as we can get to replicating the Blackboard Ally student experience of being able to transform accessible resources to other formats.</w:t>
       </w:r>
     </w:p>
-    <w:bookmarkEnd w:id="25"/>
-    <w:bookmarkEnd w:id="26"/>
-    <w:bookmarkStart w:id="41" w:name="theorems-and-stuff"/>
+    <w:bookmarkEnd w:id="14"/>
+    <w:bookmarkEnd w:id="15"/>
+    <w:bookmarkStart w:id="30" w:name="theorems-and-stuff"/>
     <w:p>
       <w:pPr>
         <w:pStyle w:val="Heading1"/>
@@ -698,13 +698,13 @@
         <w:pStyle w:val="BodyText"/>
       </w:pPr>
     </w:p>
-    <w:bookmarkStart w:id="28" w:name="thm:thm1"/>
+    <w:bookmarkStart w:id="17" w:name="thm:thm1"/>
     <w:p>
       <w:pPr>
         <w:pStyle w:val="TheoremStyleUpright"/>
       </w:pPr>
-      <w:bookmarkStart w:id="27" w:name="thm:thm1"/>
-      <w:bookmarkEnd w:id="27"/>
+      <w:bookmarkStart w:id="16" w:name="thm:thm1"/>
+      <w:bookmarkEnd w:id="16"/>
       <w:r>
         <w:rPr>
           <w:rStyle w:val="NameStyle"/>
@@ -726,19 +726,19 @@
         <w:t xml:space="preserve">This is a theorem environment already provided by Bookdown. It still works as before.</w:t>
       </w:r>
     </w:p>
-    <w:bookmarkEnd w:id="28"/>
+    <w:bookmarkEnd w:id="17"/>
     <w:p>
       <w:pPr>
         <w:pStyle w:val="BodyText"/>
       </w:pPr>
     </w:p>
-    <w:bookmarkStart w:id="30" w:name="prp:prp1"/>
+    <w:bookmarkStart w:id="19" w:name="prp:prp1"/>
     <w:p>
       <w:pPr>
         <w:pStyle w:val="TheoremStyleUpright"/>
       </w:pPr>
-      <w:bookmarkStart w:id="29" w:name="prp:prp1"/>
-      <w:bookmarkEnd w:id="29"/>
+      <w:bookmarkStart w:id="18" w:name="prp:prp1"/>
+      <w:bookmarkEnd w:id="18"/>
       <w:r>
         <w:rPr>
           <w:rStyle w:val="NameStyle"/>
@@ -802,7 +802,7 @@
         <w:t xml:space="preserve">Reference other environments within names. Notice that you need to use a double backslash.</w:t>
       </w:r>
     </w:p>
-    <w:bookmarkEnd w:id="30"/>
+    <w:bookmarkEnd w:id="19"/>
     <w:p>
       <w:pPr>
         <w:pStyle w:val="FirstParagraph"/>
@@ -942,13 +942,13 @@
         <w:pStyle w:val="BodyText"/>
       </w:pPr>
     </w:p>
-    <w:bookmarkStart w:id="32" w:name="def:unnamed-chunk-3"/>
+    <w:bookmarkStart w:id="21" w:name="def:unnamed-chunk-3"/>
     <w:p>
       <w:pPr>
         <w:pStyle w:val="DefinitionStyle"/>
       </w:pPr>
-      <w:bookmarkStart w:id="31" w:name="def:unnamed-chunk-3"/>
-      <w:bookmarkEnd w:id="31"/>
+      <w:bookmarkStart w:id="20" w:name="def:unnamed-chunk-3"/>
+      <w:bookmarkEnd w:id="20"/>
       <w:r>
         <w:rPr>
           <w:rStyle w:val="NameStyle"/>
@@ -970,13 +970,13 @@
         <w:t xml:space="preserve">You can leave some things numbered on their own.</w:t>
       </w:r>
     </w:p>
-    <w:bookmarkEnd w:id="32"/>
+    <w:bookmarkEnd w:id="21"/>
     <w:p>
       <w:pPr>
         <w:pStyle w:val="BodyText"/>
       </w:pPr>
     </w:p>
-    <w:bookmarkStart w:id="33" w:name="Def:def1"/>
+    <w:bookmarkStart w:id="22" w:name="Def:def1"/>
     <w:p>
       <w:pPr>
         <w:pStyle w:val="DefinitionStyle"/>
@@ -1056,7 +1056,7 @@
         <w:t xml:space="preserve">Take care not to reuse the inbuilt numbering labels with your new theorems! This will lead to odd things happening. The inbuilt labels to avoid are: thm, lem, cor, prp, cnj, def, exm, exr, fig, tab and eq.</w:t>
       </w:r>
     </w:p>
-    <w:bookmarkEnd w:id="33"/>
+    <w:bookmarkEnd w:id="22"/>
     <w:p>
       <w:pPr>
         <w:pStyle w:val="BodyText"/>
@@ -1136,7 +1136,7 @@
         <w:t xml:space="preserve">Here is some text which is not part of the above example.</w:t>
       </w:r>
     </w:p>
-    <w:bookmarkStart w:id="37" w:name="but-i-want-to-number-some-of-them"/>
+    <w:bookmarkStart w:id="26" w:name="but-i-want-to-number-some-of-them"/>
     <w:p>
       <w:pPr>
         <w:pStyle w:val="Heading2"/>
@@ -1150,7 +1150,7 @@
         <w:pStyle w:val="FirstParagraph"/>
       </w:pPr>
     </w:p>
-    <w:bookmarkStart w:id="34" w:name="Def:unnamed-chunk-5"/>
+    <w:bookmarkStart w:id="23" w:name="Def:unnamed-chunk-5"/>
     <w:p>
       <w:pPr>
         <w:pStyle w:val="DefinitionStyle"/>
@@ -1182,13 +1182,13 @@
         <w:t xml:space="preserve">This is unnumbered in all formats</w:t>
       </w:r>
     </w:p>
-    <w:bookmarkEnd w:id="34"/>
+    <w:bookmarkEnd w:id="23"/>
     <w:p>
       <w:pPr>
         <w:pStyle w:val="BodyText"/>
       </w:pPr>
     </w:p>
-    <w:bookmarkStart w:id="35" w:name="Def:def3"/>
+    <w:bookmarkStart w:id="24" w:name="Def:def3"/>
     <w:p>
       <w:pPr>
         <w:pStyle w:val="DefinitionStyle"/>
@@ -1220,8 +1220,8 @@
         <w:t xml:space="preserve">This should be definitions 2.3 in all formats</w:t>
       </w:r>
     </w:p>
-    <w:bookmarkEnd w:id="35"/>
-    <w:bookmarkStart w:id="36" w:name="out-of-interest"/>
+    <w:bookmarkEnd w:id="24"/>
+    <w:bookmarkStart w:id="25" w:name="out-of-interest"/>
     <w:p>
       <w:pPr>
         <w:pStyle w:val="Heading3"/>
@@ -1278,9 +1278,9 @@
         <w:t xml:space="preserve">The only real benefit to be gained from specifically declaring an environment to be unnumbered is that you are less likely to accidentally number an instance of it!</w:t>
       </w:r>
     </w:p>
-    <w:bookmarkEnd w:id="36"/>
-    <w:bookmarkEnd w:id="37"/>
-    <w:bookmarkStart w:id="40" w:name="colour-has-meaning"/>
+    <w:bookmarkEnd w:id="25"/>
+    <w:bookmarkEnd w:id="26"/>
+    <w:bookmarkStart w:id="29" w:name="colour-has-meaning"/>
     <w:p>
       <w:pPr>
         <w:pStyle w:val="Heading2"/>
@@ -1429,7 +1429,7 @@
         <w:t xml:space="preserve">This is an accessibility issue - the use of colour to highlight meaning helps with processing so we need to give you control to an extent.</w:t>
       </w:r>
     </w:p>
-    <w:bookmarkStart w:id="39" w:name="so"/>
+    <w:bookmarkStart w:id="28" w:name="so"/>
     <w:p>
       <w:pPr>
         <w:pStyle w:val="Heading3"/>
@@ -1475,7 +1475,7 @@
         <w:pStyle w:val="FirstParagraph"/>
       </w:pPr>
     </w:p>
-    <w:bookmarkStart w:id="38" w:name="Tho:unnamed-chunk-6"/>
+    <w:bookmarkStart w:id="27" w:name="Tho:unnamed-chunk-6"/>
     <w:p>
       <w:pPr>
         <w:pStyle w:val="ExampleStyle"/>
@@ -1507,11 +1507,11 @@
         <w:t xml:space="preserve">Here is a thought.</w:t>
       </w:r>
     </w:p>
-    <w:bookmarkEnd w:id="38"/>
-    <w:bookmarkEnd w:id="39"/>
-    <w:bookmarkEnd w:id="40"/>
-    <w:bookmarkEnd w:id="41"/>
-    <w:bookmarkStart w:id="57" w:name="figures-inside-other-environments"/>
+    <w:bookmarkEnd w:id="27"/>
+    <w:bookmarkEnd w:id="28"/>
+    <w:bookmarkEnd w:id="29"/>
+    <w:bookmarkEnd w:id="30"/>
+    <w:bookmarkStart w:id="46" w:name="figures-inside-other-environments"/>
     <w:p>
       <w:pPr>
         <w:pStyle w:val="Heading1"/>
@@ -1520,7 +1520,7 @@
         <w:t xml:space="preserve">Figures inside other environments</w:t>
       </w:r>
     </w:p>
-    <w:bookmarkStart w:id="46" w:name="here-is-a-figure"/>
+    <w:bookmarkStart w:id="35" w:name="here-is-a-figure"/>
     <w:p>
       <w:pPr>
         <w:pStyle w:val="Heading2"/>
@@ -1536,26 +1536,26 @@
       <w:r>
         <w:drawing>
           <wp:inline>
-            <wp:extent cx="3429000" cy="2743200"/>
+            <wp:extent cx="3566160" cy="2852928"/>
             <wp:effectExtent b="0" l="0" r="0" t="0"/>
-            <wp:docPr descr="Figure 3.1: This is title and a caption with a reference 2.1 inside it" title="This is the alternative text" id="43" name="Picture"/>
+            <wp:docPr descr="Figure 3.1: This is title and a caption with a reference 2.1 inside it" title="This is the alternative text" id="32" name="Picture"/>
             <a:graphic>
               <a:graphicData uri="http://schemas.openxmlformats.org/drawingml/2006/picture">
                 <pic:pic>
                   <pic:nvPicPr>
-                    <pic:cNvPr descr="./Notes_files/figures/cars-plot-1.svg" id="44" name="Picture"/>
+                    <pic:cNvPr descr="./Notes_files/figures/cars-plot-1.svg" id="33" name="Picture"/>
                     <pic:cNvPicPr>
                       <a:picLocks noChangeArrowheads="1" noChangeAspect="1"/>
                     </pic:cNvPicPr>
                   </pic:nvPicPr>
                   <pic:blipFill>
-                    <a:blip r:embed="rId45">
+                    <a:blip r:embed="rId34">
                       <a:extLst>
                         <a:ext uri="{28A0092B-C50C-407E-A947-70E740481C1C}">
                           <a14:useLocalDpi xmlns:a14="http://schemas.microsoft.com/office/drawing/2010/main" val="0"/>
                         </a:ext>
                         <a:ext uri="{96DAC541-7B7A-43D3-8B79-37D633B846F1}">
-                          <asvg:svgBlip xmlns:asvg="http://schemas.microsoft.com/office/drawing/2016/SVG/main" r:embed="rId42"/>
+                          <asvg:svgBlip xmlns:asvg="http://schemas.microsoft.com/office/drawing/2016/SVG/main" r:embed="rId31"/>
                         </a:ext>
                       </a:extLst>
                     </a:blip>
@@ -1566,7 +1566,7 @@
                   <pic:spPr bwMode="auto">
                     <a:xfrm>
                       <a:off x="0" y="0"/>
-                      <a:ext cx="3429000" cy="2743200"/>
+                      <a:ext cx="3566160" cy="2852928"/>
                     </a:xfrm>
                     <a:prstGeom prst="rect">
                       <a:avLst/>
@@ -1605,8 +1605,8 @@
         <w:t xml:space="preserve">inside it</w:t>
       </w:r>
     </w:p>
-    <w:bookmarkEnd w:id="46"/>
-    <w:bookmarkStart w:id="52" w:name="X9a2fb9fd4ffabed5ba3e5c576673bfe2e87587c"/>
+    <w:bookmarkEnd w:id="35"/>
+    <w:bookmarkStart w:id="41" w:name="X9a2fb9fd4ffabed5ba3e5c576673bfe2e87587c"/>
     <w:p>
       <w:pPr>
         <w:pStyle w:val="Heading2"/>
@@ -1620,13 +1620,13 @@
         <w:pStyle w:val="FirstParagraph"/>
       </w:pPr>
     </w:p>
-    <w:bookmarkStart w:id="51" w:name="exm:unnamed-chunk-7"/>
+    <w:bookmarkStart w:id="40" w:name="exm:unnamed-chunk-7"/>
     <w:p>
       <w:pPr>
         <w:pStyle w:val="ExampleStyle"/>
       </w:pPr>
-      <w:bookmarkStart w:id="47" w:name="exm:unnamed-chunk-7"/>
-      <w:bookmarkEnd w:id="47"/>
+      <w:bookmarkStart w:id="36" w:name="exm:unnamed-chunk-7"/>
+      <w:bookmarkEnd w:id="36"/>
       <w:r>
         <w:rPr>
           <w:rStyle w:val="NameStyle"/>
@@ -1655,26 +1655,26 @@
       <w:r>
         <w:drawing>
           <wp:inline>
-            <wp:extent cx="3429000" cy="2743200"/>
+            <wp:extent cx="3566160" cy="2852928"/>
             <wp:effectExtent b="0" l="0" r="0" t="0"/>
-            <wp:docPr descr="Figure 3.2: Something to do with cars" title="Some more meaningful alternative text?" id="48" name="Picture"/>
+            <wp:docPr descr="Figure 3.2: Something to do with cars" title="Some more meaningful alternative text?" id="37" name="Picture"/>
             <a:graphic>
               <a:graphicData uri="http://schemas.openxmlformats.org/drawingml/2006/picture">
                 <pic:pic>
                   <pic:nvPicPr>
-                    <pic:cNvPr descr="./Notes_files/figures/cars-plot-1.svg" id="49" name="Picture"/>
+                    <pic:cNvPr descr="./Notes_files/figures/cars-plot-1.svg" id="38" name="Picture"/>
                     <pic:cNvPicPr>
                       <a:picLocks noChangeArrowheads="1" noChangeAspect="1"/>
                     </pic:cNvPicPr>
                   </pic:nvPicPr>
                   <pic:blipFill>
-                    <a:blip r:embed="rId50">
+                    <a:blip r:embed="rId39">
                       <a:extLst>
                         <a:ext uri="{28A0092B-C50C-407E-A947-70E740481C1C}">
                           <a14:useLocalDpi xmlns:a14="http://schemas.microsoft.com/office/drawing/2010/main" val="0"/>
                         </a:ext>
                         <a:ext uri="{96DAC541-7B7A-43D3-8B79-37D633B846F1}">
-                          <asvg:svgBlip xmlns:asvg="http://schemas.microsoft.com/office/drawing/2016/SVG/main" r:embed="rId42"/>
+                          <asvg:svgBlip xmlns:asvg="http://schemas.microsoft.com/office/drawing/2016/SVG/main" r:embed="rId31"/>
                         </a:ext>
                       </a:extLst>
                     </a:blip>
@@ -1685,7 +1685,7 @@
                   <pic:spPr bwMode="auto">
                     <a:xfrm>
                       <a:off x="0" y="0"/>
-                      <a:ext cx="3429000" cy="2743200"/>
+                      <a:ext cx="3566160" cy="2852928"/>
                     </a:xfrm>
                     <a:prstGeom prst="rect">
                       <a:avLst/>
@@ -1720,9 +1720,9 @@
         <w:t xml:space="preserve">This is a test. So, you need an empty line before and after the above for it to be a float. At the end of an environment this means that you need TWO empty lines. This is Pandoc.</w:t>
       </w:r>
     </w:p>
-    <w:bookmarkEnd w:id="51"/>
-    <w:bookmarkEnd w:id="52"/>
-    <w:bookmarkStart w:id="56" w:name="Xc9cd82723d42774b05902fcea8575df5a3c6b47"/>
+    <w:bookmarkEnd w:id="40"/>
+    <w:bookmarkEnd w:id="41"/>
+    <w:bookmarkStart w:id="45" w:name="Xc9cd82723d42774b05902fcea8575df5a3c6b47"/>
     <w:p>
       <w:pPr>
         <w:pStyle w:val="Heading2"/>
@@ -1782,26 +1782,26 @@
       <w:r>
         <w:drawing>
           <wp:inline>
-            <wp:extent cx="3429000" cy="2743200"/>
+            <wp:extent cx="3566160" cy="2852928"/>
             <wp:effectExtent b="0" l="0" r="0" t="0"/>
-            <wp:docPr descr="Figure 3.3: More cars things" title="This is a scatterplot with speed on the x-axis and distance on the y-axis, please read the long description for details." id="53" name="Picture"/>
+            <wp:docPr descr="Figure 3.3: More cars things" title="This is a scatterplot with speed on the x-axis and distance on the y-axis, please read the long description for details." id="42" name="Picture"/>
             <a:graphic>
               <a:graphicData uri="http://schemas.openxmlformats.org/drawingml/2006/picture">
                 <pic:pic>
                   <pic:nvPicPr>
-                    <pic:cNvPr descr="./Notes_files/figures/cars-plot-1.svg" id="54" name="Picture"/>
+                    <pic:cNvPr descr="./Notes_files/figures/cars-plot-1.svg" id="43" name="Picture"/>
                     <pic:cNvPicPr>
                       <a:picLocks noChangeArrowheads="1" noChangeAspect="1"/>
                     </pic:cNvPicPr>
                   </pic:nvPicPr>
                   <pic:blipFill>
-                    <a:blip r:embed="rId55">
+                    <a:blip r:embed="rId44">
                       <a:extLst>
                         <a:ext uri="{28A0092B-C50C-407E-A947-70E740481C1C}">
                           <a14:useLocalDpi xmlns:a14="http://schemas.microsoft.com/office/drawing/2010/main" val="0"/>
                         </a:ext>
                         <a:ext uri="{96DAC541-7B7A-43D3-8B79-37D633B846F1}">
-                          <asvg:svgBlip xmlns:asvg="http://schemas.microsoft.com/office/drawing/2016/SVG/main" r:embed="rId42"/>
+                          <asvg:svgBlip xmlns:asvg="http://schemas.microsoft.com/office/drawing/2016/SVG/main" r:embed="rId31"/>
                         </a:ext>
                       </a:extLst>
                     </a:blip>
@@ -1812,7 +1812,7 @@
                   <pic:spPr bwMode="auto">
                     <a:xfrm>
                       <a:off x="0" y="0"/>
-                      <a:ext cx="3429000" cy="2743200"/>
+                      <a:ext cx="3566160" cy="2852928"/>
                     </a:xfrm>
                     <a:prstGeom prst="rect">
                       <a:avLst/>
@@ -1839,9 +1839,9 @@
         <w:t xml:space="preserve">Figure 3.3: More cars things</w:t>
       </w:r>
     </w:p>
-    <w:bookmarkEnd w:id="56"/>
-    <w:bookmarkEnd w:id="57"/>
-    <w:bookmarkStart w:id="63" w:name="repeating-environments"/>
+    <w:bookmarkEnd w:id="45"/>
+    <w:bookmarkEnd w:id="46"/>
+    <w:bookmarkStart w:id="52" w:name="repeating-environments"/>
     <w:p>
       <w:pPr>
         <w:pStyle w:val="Heading1"/>
@@ -1887,13 +1887,13 @@
         <w:pStyle w:val="BodyText"/>
       </w:pPr>
     </w:p>
-    <w:bookmarkStart w:id="59" w:name="thm:thm1"/>
+    <w:bookmarkStart w:id="48" w:name="thm:thm1"/>
     <w:p>
       <w:pPr>
         <w:pStyle w:val="TheoremStyleUpright"/>
       </w:pPr>
-      <w:bookmarkStart w:id="58" w:name="thm:thm1"/>
-      <w:bookmarkEnd w:id="58"/>
+      <w:bookmarkStart w:id="47" w:name="thm:thm1"/>
+      <w:bookmarkEnd w:id="47"/>
       <w:r>
         <w:rPr>
           <w:rStyle w:val="NameStyle"/>
@@ -1915,7 +1915,7 @@
         <w:t xml:space="preserve">This is a theorem environment already provided by Bookdown. It still works as before.</w:t>
       </w:r>
     </w:p>
-    <w:bookmarkEnd w:id="59"/>
+    <w:bookmarkEnd w:id="48"/>
     <w:p>
       <w:pPr>
         <w:pStyle w:val="BodyText"/>
@@ -1929,13 +1929,13 @@
         <w:pStyle w:val="BodyText"/>
       </w:pPr>
     </w:p>
-    <w:bookmarkStart w:id="61" w:name="prp:prp1"/>
+    <w:bookmarkStart w:id="50" w:name="prp:prp1"/>
     <w:p>
       <w:pPr>
         <w:pStyle w:val="TheoremStyleUpright"/>
       </w:pPr>
-      <w:bookmarkStart w:id="60" w:name="prp:prp1"/>
-      <w:bookmarkEnd w:id="60"/>
+      <w:bookmarkStart w:id="49" w:name="prp:prp1"/>
+      <w:bookmarkEnd w:id="49"/>
       <w:r>
         <w:rPr>
           <w:rStyle w:val="NameStyle"/>
@@ -1999,7 +1999,7 @@
         <w:t xml:space="preserve">Reference other environments within names. Notice that you need to use a double backslash.</w:t>
       </w:r>
     </w:p>
-    <w:bookmarkEnd w:id="61"/>
+    <w:bookmarkEnd w:id="50"/>
     <w:p>
       <w:pPr>
         <w:pStyle w:val="FirstParagraph"/>
@@ -2013,7 +2013,7 @@
         <w:pStyle w:val="BodyText"/>
       </w:pPr>
     </w:p>
-    <w:bookmarkStart w:id="62" w:name="Def:def1"/>
+    <w:bookmarkStart w:id="51" w:name="Def:def1"/>
     <w:p>
       <w:pPr>
         <w:pStyle w:val="DefinitionStyle"/>
@@ -2093,7 +2093,7 @@
         <w:t xml:space="preserve">Take care not to reuse the inbuilt numbering labels with your new theorems! This will lead to odd things happening. The inbuilt labels to avoid are: thm, lem, cor, prp, cnj, def, exm, exr, fig, tab and eq.</w:t>
       </w:r>
     </w:p>
-    <w:bookmarkEnd w:id="62"/>
+    <w:bookmarkEnd w:id="51"/>
     <w:p>
       <w:pPr>
         <w:pStyle w:val="BodyText"/>
@@ -2102,8 +2102,8 @@
         <w:t xml:space="preserve">I still need to test the other combinations. Please tell me if it is broken.</w:t>
       </w:r>
     </w:p>
-    <w:bookmarkEnd w:id="63"/>
-    <w:bookmarkStart w:id="64" w:name="but-i-want-it-to-do"/>
+    <w:bookmarkEnd w:id="52"/>
+    <w:bookmarkStart w:id="53" w:name="but-i-want-it-to-do"/>
     <w:p>
       <w:pPr>
         <w:pStyle w:val="Heading1"/>
@@ -2128,8 +2128,8 @@
         <w:t xml:space="preserve">Tell us what to do next. We’ll tell you if it is possible and the likely priority!</w:t>
       </w:r>
     </w:p>
-    <w:bookmarkEnd w:id="64"/>
-    <w:bookmarkStart w:id="65" w:name="latex-newcommands-usepackages-etc."/>
+    <w:bookmarkEnd w:id="53"/>
+    <w:bookmarkStart w:id="54" w:name="latex-newcommands-usepackages-etc."/>
     <w:p>
       <w:pPr>
         <w:pStyle w:val="Heading1"/>
@@ -2180,24 +2180,26 @@
           <m:r>
             <m:t>O</m:t>
           </m:r>
-          <m:d>
-            <m:dPr>
-              <m:begChr m:val="("/>
-              <m:sepChr m:val=""/>
-              <m:endChr m:val=")"/>
-              <m:grow/>
-            </m:dPr>
-            <m:e>
-              <m:r>
-                <m:t>x</m:t>
-              </m:r>
-            </m:e>
-          </m:d>
+          <m:r>
+            <m:rPr>
+              <m:sty m:val="p"/>
+            </m:rPr>
+            <m:t>(</m:t>
+          </m:r>
+          <m:r>
+            <m:t>x</m:t>
+          </m:r>
+          <m:r>
+            <m:rPr>
+              <m:sty m:val="p"/>
+            </m:rPr>
+            <m:t>)</m:t>
+          </m:r>
         </m:oMath>
       </m:oMathPara>
     </w:p>
-    <w:bookmarkEnd w:id="65"/>
-    <w:bookmarkStart w:id="77" w:name="great.-how-do-i-use-this-thing"/>
+    <w:bookmarkEnd w:id="54"/>
+    <w:bookmarkStart w:id="66" w:name="great.-how-do-i-use-this-thing"/>
     <w:p>
       <w:pPr>
         <w:pStyle w:val="Heading1"/>
@@ -2214,7 +2216,7 @@
         <w:t xml:space="preserve">This package is not on CRAN and it is not going to be in the short or medium term. Instead you need to install it directly from github (if you want to know why then get in touch and ask) which means you will need devtools installed and loaded.</w:t>
       </w:r>
     </w:p>
-    <w:bookmarkStart w:id="66" w:name="installing-clavertondown"/>
+    <w:bookmarkStart w:id="55" w:name="installing-clavertondown"/>
     <w:p>
       <w:pPr>
         <w:pStyle w:val="Heading2"/>
@@ -2269,8 +2271,8 @@
         <w:t xml:space="preserve">Obviously, you need an internet connection.</w:t>
       </w:r>
     </w:p>
-    <w:bookmarkEnd w:id="66"/>
-    <w:bookmarkStart w:id="70" w:name="using-clavertondown-for-the-first-time"/>
+    <w:bookmarkEnd w:id="55"/>
+    <w:bookmarkStart w:id="59" w:name="using-clavertondown-for-the-first-time"/>
     <w:p>
       <w:pPr>
         <w:pStyle w:val="Heading2"/>
@@ -2295,7 +2297,7 @@
           <w:numId w:val="1013"/>
         </w:numPr>
       </w:pPr>
-      <w:hyperlink r:id="rId67">
+      <w:hyperlink r:id="rId56">
         <w:r>
           <w:rPr>
             <w:rStyle w:val="Hyperlink"/>
@@ -2312,7 +2314,7 @@
           <w:numId w:val="1013"/>
         </w:numPr>
       </w:pPr>
-      <w:hyperlink r:id="rId68">
+      <w:hyperlink r:id="rId57">
         <w:r>
           <w:rPr>
             <w:rStyle w:val="Hyperlink"/>
@@ -2337,7 +2339,7 @@
         <w:t xml:space="preserve">Then… read the files.</w:t>
       </w:r>
     </w:p>
-    <w:bookmarkStart w:id="69" w:name="using-the-command-line"/>
+    <w:bookmarkStart w:id="58" w:name="using-the-command-line"/>
     <w:p>
       <w:pPr>
         <w:pStyle w:val="Heading3"/>
@@ -2492,9 +2494,9 @@
         <w:t xml:space="preserve">The pdf_clav command renders standard print, clear print and large print PDF.</w:t>
       </w:r>
     </w:p>
-    <w:bookmarkEnd w:id="69"/>
-    <w:bookmarkEnd w:id="70"/>
-    <w:bookmarkStart w:id="76" w:name="moving-from-bookdown-to-clavertondown"/>
+    <w:bookmarkEnd w:id="58"/>
+    <w:bookmarkEnd w:id="59"/>
+    <w:bookmarkStart w:id="65" w:name="moving-from-bookdown-to-clavertondown"/>
     <w:p>
       <w:pPr>
         <w:pStyle w:val="Heading2"/>
@@ -2511,7 +2513,7 @@
         <w:t xml:space="preserve">If you have been using Bookdown you may find that simply making changes to your preamble, as per the files above, will result in everything working as expected. You can then start using additional ClavertonDown functionality. If you do not use any of it then your content will, at the time of writing, still work in Bookdown if you change your preamble back. However, if you do not wish to use the additional functionality you should consider whether moving to ClavertonDown is the right choice for you - we are diverging from Bookdown and we cannot guarantee ongoing backwards compatibility. You should also consider that Bookdown is changing in ways that ClavertonDown will not and these are explained in the below section.</w:t>
       </w:r>
     </w:p>
-    <w:bookmarkStart w:id="73" w:name="X22cc54866afc1f2e3324c1ce92747000cbc9279"/>
+    <w:bookmarkStart w:id="62" w:name="X22cc54866afc1f2e3324c1ce92747000cbc9279"/>
     <w:p>
       <w:pPr>
         <w:pStyle w:val="Heading3"/>
@@ -2530,7 +2532,7 @@
       <w:r>
         <w:t xml:space="preserve"> </w:t>
       </w:r>
-      <w:hyperlink r:id="rId71">
+      <w:hyperlink r:id="rId60">
         <w:r>
           <w:rPr>
             <w:rStyle w:val="Hyperlink"/>
@@ -2547,7 +2549,7 @@
       <w:r>
         <w:t xml:space="preserve"> </w:t>
       </w:r>
-      <w:hyperlink r:id="rId72">
+      <w:hyperlink r:id="rId61">
         <w:r>
           <w:rPr>
             <w:rStyle w:val="Hyperlink"/>
@@ -2582,7 +2584,7 @@
           <w:numId w:val="1014"/>
         </w:numPr>
       </w:pPr>
-      <w:hyperlink r:id="rId72">
+      <w:hyperlink r:id="rId61">
         <w:r>
           <w:rPr>
             <w:rStyle w:val="Hyperlink"/>
@@ -2652,7 +2654,7 @@
       <w:r>
         <w:t xml:space="preserve"> </w:t>
       </w:r>
-      <w:hyperlink r:id="rId72">
+      <w:hyperlink r:id="rId61">
         <w:r>
           <w:rPr>
             <w:rStyle w:val="Hyperlink"/>
@@ -2691,8 +2693,8 @@
         <w:t xml:space="preserve">We assume you are transforming for a reason - to use the functionality of ClavertonDown. In this case any transform back will require you to undo any use of our extra functionality.</w:t>
       </w:r>
     </w:p>
-    <w:bookmarkEnd w:id="73"/>
-    <w:bookmarkStart w:id="75" w:name="i-want-to-transform-anyway"/>
+    <w:bookmarkEnd w:id="62"/>
+    <w:bookmarkStart w:id="64" w:name="i-want-to-transform-anyway"/>
     <w:p>
       <w:pPr>
         <w:pStyle w:val="Heading3"/>
@@ -2789,7 +2791,7 @@
           <w:numId w:val="1016"/>
         </w:numPr>
       </w:pPr>
-      <w:hyperlink r:id="rId74">
+      <w:hyperlink r:id="rId63">
         <w:r>
           <w:rPr>
             <w:rStyle w:val="Hyperlink"/>
@@ -2833,10 +2835,10 @@
         <w:t xml:space="preserve">.</w:t>
       </w:r>
     </w:p>
-    <w:bookmarkEnd w:id="75"/>
-    <w:bookmarkEnd w:id="76"/>
-    <w:bookmarkEnd w:id="77"/>
-    <w:bookmarkStart w:id="78" w:name="X00d3d37b6d4ddc8f72526149020f0b2d3a0855f"/>
+    <w:bookmarkEnd w:id="64"/>
+    <w:bookmarkEnd w:id="65"/>
+    <w:bookmarkEnd w:id="66"/>
+    <w:bookmarkStart w:id="67" w:name="X00d3d37b6d4ddc8f72526149020f0b2d3a0855f"/>
     <w:p>
       <w:pPr>
         <w:pStyle w:val="Heading1"/>
@@ -2853,7 +2855,7 @@
         <w:t xml:space="preserve">Yes, sure, that is why it is public. But, this is released with no promises and no warranty. Help will only be provided to staff and students of the University of Bath but we might fix bugs or consider suggestions by others.</w:t>
       </w:r>
     </w:p>
-    <w:bookmarkEnd w:id="78"/>
+    <w:bookmarkEnd w:id="67"/>
     <w:sectPr>
       <w:pgSz w:h="15840" w:w="12240"/>
       <w:pgMar w:bottom="1440" w:footer="720" w:gutter="0" w:header="720" w:left="1440" w:right="1440" w:top="1440"/>

</xml_diff>